<commit_message>
Center navigation and refine CV link styling and destinations
</commit_message>
<xml_diff>
--- a/cv/Khadijah_Aamir_Chaudhry_Academic_CV.docx
+++ b/cv/Khadijah_Aamir_Chaudhry_Academic_CV.docx
@@ -8,16 +8,14 @@
         <w:spacing w:after="0"/>
         <w:jc w:val="center"/>
       </w:pPr>
-      <w:hyperlink r:id="rId12">
-        <w:r>
-          <w:rPr>
-            <w:rFonts w:ascii="Times New Roman" w:hAnsi="Times New Roman"/>
-            <w:b/>
-            <w:sz w:val="34"/>
-          </w:rPr>
-          <w:t xml:space="preserve">Khadijah Aamir Chaudhry</w:t>
-        </w:r>
-      </w:hyperlink>
+      <w:r>
+        <w:rPr>
+          <w:rFonts w:ascii="Times New Roman" w:hAnsi="Times New Roman"/>
+          <w:b/>
+          <w:sz w:val="34"/>
+        </w:rPr>
+        <w:t>Khadijah Aamir Chaudhry</w:t>
+      </w:r>
     </w:p>
     <w:p>
       <w:pPr>
@@ -91,14 +89,12 @@
           <w:tab w:pos="10296" w:val="right"/>
         </w:tabs>
       </w:pPr>
-      <w:hyperlink r:id="rId13">
-        <w:r>
-          <w:rPr>
-            <w:b/>
-          </w:rPr>
-          <w:t xml:space="preserve">Lahore University of Management Sciences (LUMS)</w:t>
-        </w:r>
-      </w:hyperlink>
+      <w:r>
+        <w:rPr>
+          <w:b/>
+        </w:rPr>
+        <w:t>Lahore University of Management Sciences (LUMS)</w:t>
+      </w:r>
       <w:r>
         <w:tab/>
       </w:r>
@@ -203,10 +199,11 @@
         </w:rPr>
         <w:t xml:space="preserve">Research Assistant, </w:t>
       </w:r>
-      <w:hyperlink r:id="rId14">
+      <w:hyperlink r:id="rId12">
         <w:r>
           <w:rPr>
             <w:b/>
+            <w:color w:val="175A86"/>
           </w:rPr>
           <w:t xml:space="preserve">CHASE Lab</w:t>
         </w:r>
@@ -237,8 +234,11 @@
       <w:r>
         <w:t xml:space="preserve">Supervisor: </w:t>
       </w:r>
-      <w:hyperlink r:id="rId15">
+      <w:hyperlink r:id="rId13">
         <w:r>
+          <w:rPr>
+            <w:color w:val="175A86"/>
+          </w:rPr>
           <w:t xml:space="preserve">Dr. Muhammad Ali Siddiqi</w:t>
         </w:r>
       </w:hyperlink>
@@ -300,10 +300,11 @@
         </w:rPr>
         <w:t xml:space="preserve">Research Assistant, </w:t>
       </w:r>
-      <w:hyperlink r:id="rId16">
+      <w:hyperlink r:id="rId14">
         <w:r>
           <w:rPr>
             <w:b/>
+            <w:color w:val="175A86"/>
           </w:rPr>
           <w:t xml:space="preserve">SysNet Lab</w:t>
         </w:r>
@@ -334,8 +335,11 @@
       <w:r>
         <w:t xml:space="preserve">Supervisor: </w:t>
       </w:r>
-      <w:hyperlink r:id="rId17">
+      <w:hyperlink r:id="rId15">
         <w:r>
+          <w:rPr>
+            <w:color w:val="175A86"/>
+          </w:rPr>
           <w:t xml:space="preserve">Dr. Naveed Anwar Bhatti</w:t>
         </w:r>
       </w:hyperlink>
@@ -404,10 +408,11 @@
           <w:tab w:pos="10296" w:val="right"/>
         </w:tabs>
       </w:pPr>
-      <w:hyperlink r:id="rId18">
+      <w:hyperlink r:id="rId16">
         <w:r>
           <w:rPr>
             <w:b/>
+            <w:color w:val="175A86"/>
           </w:rPr>
           <w:t xml:space="preserve">On Chip Behavioral Monitoring</w:t>
         </w:r>
@@ -473,10 +478,11 @@
           <w:tab w:pos="10296" w:val="right"/>
         </w:tabs>
       </w:pPr>
-      <w:hyperlink r:id="rId19">
+      <w:hyperlink r:id="rId17">
         <w:r>
           <w:rPr>
             <w:b/>
+            <w:color w:val="175A86"/>
           </w:rPr>
           <w:t xml:space="preserve">Protected Media Containers</w:t>
         </w:r>
@@ -542,10 +548,11 @@
           <w:tab w:pos="10296" w:val="right"/>
         </w:tabs>
       </w:pPr>
-      <w:hyperlink r:id="rId20">
+      <w:hyperlink r:id="rId18">
         <w:r>
           <w:rPr>
             <w:b/>
+            <w:color w:val="175A86"/>
           </w:rPr>
           <w:t xml:space="preserve">EyeSense: Mobile Eyesight Screening</w:t>
         </w:r>
@@ -611,10 +618,11 @@
           <w:tab w:pos="10296" w:val="right"/>
         </w:tabs>
       </w:pPr>
-      <w:hyperlink r:id="rId21">
+      <w:hyperlink r:id="rId19">
         <w:r>
           <w:rPr>
             <w:b/>
+            <w:color w:val="175A86"/>
           </w:rPr>
           <w:t xml:space="preserve">Post-Quantum Cryptography on ESP32</w:t>
         </w:r>
@@ -640,14 +648,12 @@
       <w:r>
         <w:t xml:space="preserve">• Benchmarked </w:t>
       </w:r>
-      <w:hyperlink r:id="rId22">
-        <w:r>
-          <w:rPr>
-            <w:b/>
-          </w:rPr>
-          <w:t xml:space="preserve">Kyber-512, Light-SABER, and Dilithium-II</w:t>
-        </w:r>
-      </w:hyperlink>
+      <w:r>
+        <w:rPr>
+          <w:b/>
+        </w:rPr>
+        <w:t>Kyber-512, Light-SABER, and Dilithium-II</w:t>
+      </w:r>
       <w:r>
         <w:t xml:space="preserve"> on ESP32 to assess post-quantum cryptography on resource-constrained hardware.</w:t>
       </w:r>
@@ -682,26 +688,11 @@
           <w:tab w:pos="10296" w:val="right"/>
         </w:tabs>
       </w:pPr>
-      <w:r>
-        <w:rPr>
-          <w:b/>
-        </w:rPr>
-        <w:t>Other technical projects</w:t>
-      </w:r>
-    </w:p>
-    <w:p>
-      <w:pPr>
-        <w:pStyle w:val="CVEntry"/>
-        <w:keepNext/>
-        <w:widowControl/>
-        <w:tabs>
-          <w:tab w:pos="10296" w:val="right"/>
-        </w:tabs>
-      </w:pPr>
-      <w:hyperlink r:id="rId23">
+      <w:hyperlink r:id="rId20">
         <w:r>
           <w:rPr>
             <w:b/>
+            <w:color w:val="175A86"/>
           </w:rPr>
           <w:t xml:space="preserve">AasPass Peer Tutoring</w:t>
         </w:r>
@@ -758,10 +749,11 @@
           <w:tab w:pos="10296" w:val="right"/>
         </w:tabs>
       </w:pPr>
-      <w:hyperlink r:id="rId24">
+      <w:hyperlink r:id="rId21">
         <w:r>
           <w:rPr>
             <w:b/>
+            <w:color w:val="175A86"/>
           </w:rPr>
           <w:t xml:space="preserve">Spotify Mood Classification and Recommendation</w:t>
         </w:r>
@@ -827,10 +819,11 @@
           <w:tab w:pos="10296" w:val="right"/>
         </w:tabs>
       </w:pPr>
-      <w:hyperlink r:id="rId25">
+      <w:hyperlink r:id="rId22">
         <w:r>
           <w:rPr>
             <w:b/>
+            <w:color w:val="175A86"/>
           </w:rPr>
           <w:t xml:space="preserve">ROM-Based Digital Lock</w:t>
         </w:r>
@@ -986,10 +979,11 @@
         </w:rPr>
         <w:t xml:space="preserve">Marketing Manager, </w:t>
       </w:r>
-      <w:hyperlink r:id="rId26">
+      <w:hyperlink r:id="rId23">
         <w:r>
           <w:rPr>
             <w:b/>
+            <w:color w:val="175A86"/>
           </w:rPr>
           <w:t xml:space="preserve">Fintelligent Solutions</w:t>
         </w:r>
@@ -1061,10 +1055,11 @@
         </w:rPr>
         <w:t xml:space="preserve">Data Collection Coach, </w:t>
       </w:r>
-      <w:hyperlink r:id="rId27">
+      <w:hyperlink r:id="rId24">
         <w:r>
           <w:rPr>
             <w:b/>
+            <w:color w:val="175A86"/>
           </w:rPr>
           <w:t xml:space="preserve">Uplift AI</w:t>
         </w:r>
@@ -1210,10 +1205,11 @@
           <w:tab w:pos="10296" w:val="right"/>
         </w:tabs>
       </w:pPr>
-      <w:hyperlink r:id="rId28">
+      <w:hyperlink r:id="rId25">
         <w:r>
           <w:rPr>
             <w:b/>
+            <w:color w:val="175A86"/>
           </w:rPr>
           <w:t xml:space="preserve">Women in STEM Coordinator</w:t>
         </w:r>
@@ -1289,16 +1285,8 @@
         <w:rPr>
           <w:b/>
         </w:rPr>
-        <w:t xml:space="preserve">Co-Founder and Logistics Director, </w:t>
+        <w:t>Co-Founder and Logistics Director, Umeed-e-Nau</w:t>
       </w:r>
-      <w:hyperlink r:id="rId29">
-        <w:r>
-          <w:rPr>
-            <w:b/>
-          </w:rPr>
-          <w:t xml:space="preserve">Umeed-e-Nau</w:t>
-        </w:r>
-      </w:hyperlink>
       <w:r>
         <w:tab/>
       </w:r>
@@ -1318,15 +1306,7 @@
         <w:ind w:left="202" w:hanging="144"/>
       </w:pPr>
       <w:r>
-        <w:t xml:space="preserve">• Co-founded </w:t>
-      </w:r>
-      <w:hyperlink r:id="rId29">
-        <w:r>
-          <w:t xml:space="preserve">Umeed-e-Nau</w:t>
-        </w:r>
-      </w:hyperlink>
-      <w:r>
-        <w:t xml:space="preserve">, an NGO providing </w:t>
+        <w:t xml:space="preserve">• Co-founded Umeed-e-Nau, an NGO providing </w:t>
       </w:r>
       <w:r>
         <w:rPr>

</xml_diff>